<commit_message>
Use 21 Connect Digital as the company everywhere
Co-Authored-By: Claude Sonnet 5.5 <noreply@anthropic.com>
</commit_message>
<xml_diff>
--- a/resumes/Kendall_Clark_FrontEnd_Developer_Resume.docx
+++ b/resumes/Kendall_Clark_FrontEnd_Developer_Resume.docx
@@ -92,11 +92,21 @@
         <w:t>Product Designer</w:t>
       </w:r>
       <w:r>
-        <w:t xml:space="preserve">  |  Towpath Creative  |  Part-time, remote</w:t>
+        <w:t xml:space="preserve">  |  21 Connect Digital  |  Part-time, remote</w:t>
       </w:r>
       <w:r>
         <w:tab/>
         <w:t>Sep 2024 - Present</w:t>
+      </w:r>
+    </w:p>
+    <w:p>
+      <w:pPr>
+        <w:pStyle w:val="ListBullet"/>
+        <w:spacing w:after="20"/>
+        <w:ind w:left="317"/>
+      </w:pPr>
+      <w:r>
+        <w:t>Client engagements: Winsor Pilates membership site (2025), Haus of Alt brand and Shopify store (2025), Nina's Cleaning Service brand, site, and local SEO (2025 to 2026), Max Noir creator site (2026), ClearBot Shopify storefront (2026), Nu-Fix contractor site (2026).</w:t>
       </w:r>
     </w:p>
     <w:p>

</xml_diff>

<commit_message>
Resumes: add barista roles and offer-accepted notes to close gaps
Co-Authored-By: Claude Sonnet 5.5 <noreply@anthropic.com>
</commit_message>
<xml_diff>
--- a/resumes/Kendall_Clark_FrontEnd_Developer_Resume.docx
+++ b/resumes/Kendall_Clark_FrontEnd_Developer_Resume.docx
@@ -150,10 +150,41 @@
         <w:rPr>
           <w:b/>
         </w:rPr>
+        <w:t>Barista and Bakery Associate</w:t>
+      </w:r>
+      <w:r>
+        <w:t xml:space="preserve">  |  New York, NY  |  Part-time</w:t>
+      </w:r>
+      <w:r>
+        <w:tab/>
+        <w:t>May 2024 - Aug 2024</w:t>
+      </w:r>
+    </w:p>
+    <w:p>
+      <w:pPr>
+        <w:pStyle w:val="ListBullet"/>
+        <w:spacing w:after="20"/>
+        <w:ind w:left="317"/>
+      </w:pPr>
+      <w:r>
+        <w:t>Worked in a cafe and bakery in New York before starting at 21 Connect Digital in September 2024.</w:t>
+      </w:r>
+    </w:p>
+    <w:p>
+      <w:pPr>
+        <w:tabs>
+          <w:tab w:pos="10080" w:val="right"/>
+        </w:tabs>
+        <w:spacing w:before="100" w:after="20"/>
+      </w:pPr>
+      <w:r>
+        <w:rPr>
+          <w:b/>
+        </w:rPr>
         <w:t>UX Designer</w:t>
       </w:r>
       <w:r>
-        <w:t xml:space="preserve">  |  American Express  |  Contract, on-site</w:t>
+        <w:t xml:space="preserve">  |  American Express  |  Contract, on-site (offer accepted Dec 2023)</w:t>
       </w:r>
       <w:r>
         <w:tab/>
@@ -222,10 +253,41 @@
         <w:rPr>
           <w:b/>
         </w:rPr>
+        <w:t>Barista</w:t>
+      </w:r>
+      <w:r>
+        <w:t xml:space="preserve">  |  New York, NY  |  Relocation and job search</w:t>
+      </w:r>
+      <w:r>
+        <w:tab/>
+        <w:t>Feb 2023 - Mar 2023</w:t>
+      </w:r>
+    </w:p>
+    <w:p>
+      <w:pPr>
+        <w:pStyle w:val="ListBullet"/>
+        <w:spacing w:after="20"/>
+        <w:ind w:left="317"/>
+      </w:pPr>
+      <w:r>
+        <w:t>Relocated and worked as a barista while searching for UX roles.</w:t>
+      </w:r>
+    </w:p>
+    <w:p>
+      <w:pPr>
+        <w:tabs>
+          <w:tab w:pos="10080" w:val="right"/>
+        </w:tabs>
+        <w:spacing w:before="100" w:after="20"/>
+      </w:pPr>
+      <w:r>
+        <w:rPr>
+          <w:b/>
+        </w:rPr>
         <w:t>Senior UX Designer</w:t>
       </w:r>
       <w:r>
-        <w:t xml:space="preserve">  |  Citi  |  Full-time, New York</w:t>
+        <w:t xml:space="preserve">  |  Citi  |  Full-time, New York (offer accepted Jun 2022)</w:t>
       </w:r>
       <w:r>
         <w:tab/>

</xml_diff>

<commit_message>
Resumes: name Burke Street Bakery for the 2024 bakery role
Co-Authored-By: Claude Sonnet 5.5 <noreply@anthropic.com>
</commit_message>
<xml_diff>
--- a/resumes/Kendall_Clark_FrontEnd_Developer_Resume.docx
+++ b/resumes/Kendall_Clark_FrontEnd_Developer_Resume.docx
@@ -153,7 +153,7 @@
         <w:t>Barista and Bakery Associate</w:t>
       </w:r>
       <w:r>
-        <w:t xml:space="preserve">  |  New York, NY  |  Part-time</w:t>
+        <w:t xml:space="preserve">  |  Burke Street Bakery  |  New York, NY, part-time</w:t>
       </w:r>
       <w:r>
         <w:tab/>
@@ -167,7 +167,7 @@
         <w:ind w:left="317"/>
       </w:pPr>
       <w:r>
-        <w:t>Worked in a cafe and bakery in New York before starting at 21 Connect Digital in September 2024.</w:t>
+        <w:t>Worked in a bakery and cafe before starting at 21 Connect Digital in September 2024.</w:t>
       </w:r>
     </w:p>
     <w:p>

</xml_diff>

<commit_message>
Resumes: add freelance and learning entry for 2020 to 2021
Co-Authored-By: Claude Sonnet 5.5 <noreply@anthropic.com>
</commit_message>
<xml_diff>
--- a/resumes/Kendall_Clark_FrontEnd_Developer_Resume.docx
+++ b/resumes/Kendall_Clark_FrontEnd_Developer_Resume.docx
@@ -446,6 +446,20 @@
         <w:rPr>
           <w:b/>
         </w:rPr>
+        <w:t>Freelance Designer and Self-Directed Learning, Independent</w:t>
+      </w:r>
+      <w:r>
+        <w:t xml:space="preserve"> (Freelance, Jan 2020 - May 2021). Took on freelance web and design work while teaching myself UX design, front-end development, and prototyping.</w:t>
+      </w:r>
+    </w:p>
+    <w:p>
+      <w:pPr>
+        <w:spacing w:after="20"/>
+      </w:pPr>
+      <w:r>
+        <w:rPr>
+          <w:b/>
+        </w:rPr>
         <w:t>Graphic User Interface Designer, For You Dental</w:t>
       </w:r>
       <w:r>

</xml_diff>